<commit_message>
CS1103 Unit 5: per-operation CRUD table in discussion (710 words)
Co-Authored-By: Claude Opus 5.5 <noreply@anthropic.com>
</commit_message>
<xml_diff>
--- a/CS1103_Programming_2/Unit5_JDBC/Discussion/Unit5_Discussion_Post.docx
+++ b/CS1103_Programming_2/Unit5_JDBC/Discussion/Unit5_Discussion_Post.docx
@@ -352,13 +352,309 @@
           <w:i w:val="0"/>
           <w:sz w:val="24"/>
         </w:rPr>
-        <w:t>Create, Read, Update, and Delete look simple, but each needs care (Samoylov, 2018):</w:t>
+        <w:t>Each CRUD operation maps to one SQL command and one JDBC method, and each has its own risk (Samoylov, 2018):</w:t>
       </w:r>
+    </w:p>
+    <w:tbl>
+      <w:tblPr>
+        <w:tblStyle w:val="TableGrid"/>
+        <w:tblW w:type="auto" w:w="0"/>
+        <w:tblLook w:firstColumn="1" w:firstRow="1" w:lastColumn="0" w:lastRow="0" w:noHBand="0" w:noVBand="1" w:val="04A0"/>
+      </w:tblPr>
+      <w:tblGrid>
+        <w:gridCol w:w="3120"/>
+        <w:gridCol w:w="3120"/>
+        <w:gridCol w:w="3120"/>
+      </w:tblGrid>
+      <w:tr>
+        <w:tc>
+          <w:tcPr>
+            <w:tcW w:type="dxa" w:w="3120"/>
+          </w:tcPr>
+          <w:p>
+            <w:pPr>
+              <w:spacing w:line="240" w:lineRule="auto"/>
+            </w:pPr>
+            <w:r>
+              <w:rPr>
+                <w:rFonts w:ascii="Times New Roman" w:hAnsi="Times New Roman"/>
+                <w:b/>
+                <w:sz w:val="21"/>
+              </w:rPr>
+              <w:t>Operation</w:t>
+            </w:r>
+          </w:p>
+        </w:tc>
+        <w:tc>
+          <w:tcPr>
+            <w:tcW w:type="dxa" w:w="3120"/>
+          </w:tcPr>
+          <w:p>
+            <w:pPr>
+              <w:spacing w:line="240" w:lineRule="auto"/>
+            </w:pPr>
+            <w:r>
+              <w:rPr>
+                <w:rFonts w:ascii="Times New Roman" w:hAnsi="Times New Roman"/>
+                <w:b/>
+                <w:sz w:val="21"/>
+              </w:rPr>
+              <w:t>SQL and JDBC</w:t>
+            </w:r>
+          </w:p>
+        </w:tc>
+        <w:tc>
+          <w:tcPr>
+            <w:tcW w:type="dxa" w:w="3120"/>
+          </w:tcPr>
+          <w:p>
+            <w:pPr>
+              <w:spacing w:line="240" w:lineRule="auto"/>
+            </w:pPr>
+            <w:r>
+              <w:rPr>
+                <w:rFonts w:ascii="Times New Roman" w:hAnsi="Times New Roman"/>
+                <w:b/>
+                <w:sz w:val="21"/>
+              </w:rPr>
+              <w:t>Key consideration</w:t>
+            </w:r>
+          </w:p>
+        </w:tc>
+      </w:tr>
+      <w:tr>
+        <w:tc>
+          <w:tcPr>
+            <w:tcW w:type="dxa" w:w="3120"/>
+          </w:tcPr>
+          <w:p>
+            <w:pPr>
+              <w:spacing w:line="240" w:lineRule="auto"/>
+            </w:pPr>
+            <w:r>
+              <w:rPr>
+                <w:rFonts w:ascii="Times New Roman" w:hAnsi="Times New Roman"/>
+                <w:b w:val="0"/>
+                <w:sz w:val="21"/>
+              </w:rPr>
+              <w:t>Create</w:t>
+            </w:r>
+          </w:p>
+        </w:tc>
+        <w:tc>
+          <w:tcPr>
+            <w:tcW w:type="dxa" w:w="3120"/>
+          </w:tcPr>
+          <w:p>
+            <w:pPr>
+              <w:spacing w:line="240" w:lineRule="auto"/>
+            </w:pPr>
+            <w:r>
+              <w:rPr>
+                <w:rFonts w:ascii="Times New Roman" w:hAnsi="Times New Roman"/>
+                <w:b w:val="0"/>
+                <w:sz w:val="21"/>
+              </w:rPr>
+              <w:t>INSERT, executeUpdate()</w:t>
+            </w:r>
+          </w:p>
+        </w:tc>
+        <w:tc>
+          <w:tcPr>
+            <w:tcW w:type="dxa" w:w="3120"/>
+          </w:tcPr>
+          <w:p>
+            <w:pPr>
+              <w:spacing w:line="240" w:lineRule="auto"/>
+            </w:pPr>
+            <w:r>
+              <w:rPr>
+                <w:rFonts w:ascii="Times New Roman" w:hAnsi="Times New Roman"/>
+                <w:b w:val="0"/>
+                <w:sz w:val="21"/>
+              </w:rPr>
+              <w:t>Validate input first; let PRIMARY KEY and NOT NULL constraints reject bad rows; batch bulk inserts</w:t>
+            </w:r>
+          </w:p>
+        </w:tc>
+      </w:tr>
+      <w:tr>
+        <w:tc>
+          <w:tcPr>
+            <w:tcW w:type="dxa" w:w="3120"/>
+          </w:tcPr>
+          <w:p>
+            <w:pPr>
+              <w:spacing w:line="240" w:lineRule="auto"/>
+            </w:pPr>
+            <w:r>
+              <w:rPr>
+                <w:rFonts w:ascii="Times New Roman" w:hAnsi="Times New Roman"/>
+                <w:b w:val="0"/>
+                <w:sz w:val="21"/>
+              </w:rPr>
+              <w:t>Read</w:t>
+            </w:r>
+          </w:p>
+        </w:tc>
+        <w:tc>
+          <w:tcPr>
+            <w:tcW w:type="dxa" w:w="3120"/>
+          </w:tcPr>
+          <w:p>
+            <w:pPr>
+              <w:spacing w:line="240" w:lineRule="auto"/>
+            </w:pPr>
+            <w:r>
+              <w:rPr>
+                <w:rFonts w:ascii="Times New Roman" w:hAnsi="Times New Roman"/>
+                <w:b w:val="0"/>
+                <w:sz w:val="21"/>
+              </w:rPr>
+              <w:t>SELECT, executeQuery() returning a ResultSet</w:t>
+            </w:r>
+          </w:p>
+        </w:tc>
+        <w:tc>
+          <w:tcPr>
+            <w:tcW w:type="dxa" w:w="3120"/>
+          </w:tcPr>
+          <w:p>
+            <w:pPr>
+              <w:spacing w:line="240" w:lineRule="auto"/>
+            </w:pPr>
+            <w:r>
+              <w:rPr>
+                <w:rFonts w:ascii="Times New Roman" w:hAnsi="Times New Roman"/>
+                <w:b w:val="0"/>
+                <w:sz w:val="21"/>
+              </w:rPr>
+              <w:t>Select only needed columns, index WHERE columns, page through large results</w:t>
+            </w:r>
+          </w:p>
+        </w:tc>
+      </w:tr>
+      <w:tr>
+        <w:tc>
+          <w:tcPr>
+            <w:tcW w:type="dxa" w:w="3120"/>
+          </w:tcPr>
+          <w:p>
+            <w:pPr>
+              <w:spacing w:line="240" w:lineRule="auto"/>
+            </w:pPr>
+            <w:r>
+              <w:rPr>
+                <w:rFonts w:ascii="Times New Roman" w:hAnsi="Times New Roman"/>
+                <w:b w:val="0"/>
+                <w:sz w:val="21"/>
+              </w:rPr>
+              <w:t>Update</w:t>
+            </w:r>
+          </w:p>
+        </w:tc>
+        <w:tc>
+          <w:tcPr>
+            <w:tcW w:type="dxa" w:w="3120"/>
+          </w:tcPr>
+          <w:p>
+            <w:pPr>
+              <w:spacing w:line="240" w:lineRule="auto"/>
+            </w:pPr>
+            <w:r>
+              <w:rPr>
+                <w:rFonts w:ascii="Times New Roman" w:hAnsi="Times New Roman"/>
+                <w:b w:val="0"/>
+                <w:sz w:val="21"/>
+              </w:rPr>
+              <w:t>UPDATE, executeUpdate()</w:t>
+            </w:r>
+          </w:p>
+        </w:tc>
+        <w:tc>
+          <w:tcPr>
+            <w:tcW w:type="dxa" w:w="3120"/>
+          </w:tcPr>
+          <w:p>
+            <w:pPr>
+              <w:spacing w:line="240" w:lineRule="auto"/>
+            </w:pPr>
+            <w:r>
+              <w:rPr>
+                <w:rFonts w:ascii="Times New Roman" w:hAnsi="Times New Roman"/>
+                <w:b w:val="0"/>
+                <w:sz w:val="21"/>
+              </w:rPr>
+              <w:t>Always include a WHERE clause and check the rows-affected count; group related changes in a transaction</w:t>
+            </w:r>
+          </w:p>
+        </w:tc>
+      </w:tr>
+      <w:tr>
+        <w:tc>
+          <w:tcPr>
+            <w:tcW w:type="dxa" w:w="3120"/>
+          </w:tcPr>
+          <w:p>
+            <w:pPr>
+              <w:spacing w:line="240" w:lineRule="auto"/>
+            </w:pPr>
+            <w:r>
+              <w:rPr>
+                <w:rFonts w:ascii="Times New Roman" w:hAnsi="Times New Roman"/>
+                <w:b w:val="0"/>
+                <w:sz w:val="21"/>
+              </w:rPr>
+              <w:t>Delete</w:t>
+            </w:r>
+          </w:p>
+        </w:tc>
+        <w:tc>
+          <w:tcPr>
+            <w:tcW w:type="dxa" w:w="3120"/>
+          </w:tcPr>
+          <w:p>
+            <w:pPr>
+              <w:spacing w:line="240" w:lineRule="auto"/>
+            </w:pPr>
+            <w:r>
+              <w:rPr>
+                <w:rFonts w:ascii="Times New Roman" w:hAnsi="Times New Roman"/>
+                <w:b w:val="0"/>
+                <w:sz w:val="21"/>
+              </w:rPr>
+              <w:t>DELETE, executeUpdate()</w:t>
+            </w:r>
+          </w:p>
+        </w:tc>
+        <w:tc>
+          <w:tcPr>
+            <w:tcW w:type="dxa" w:w="3120"/>
+          </w:tcPr>
+          <w:p>
+            <w:pPr>
+              <w:spacing w:line="240" w:lineRule="auto"/>
+            </w:pPr>
+            <w:r>
+              <w:rPr>
+                <w:rFonts w:ascii="Times New Roman" w:hAnsi="Times New Roman"/>
+                <w:b w:val="0"/>
+                <w:sz w:val="21"/>
+              </w:rPr>
+              <w:t>Foreign keys may block it; a "soft delete" that marks a row inactive keeps order history</w:t>
+            </w:r>
+          </w:p>
+        </w:tc>
+      </w:tr>
+    </w:tbl>
+    <w:p>
+      <w:pPr>
+        <w:spacing w:after="0"/>
+      </w:pPr>
     </w:p>
     <w:p>
       <w:pPr>
-        <w:spacing w:line="360" w:lineRule="auto" w:after="0"/>
-        <w:ind w:left="720" w:hanging="360"/>
+        <w:spacing w:line="360" w:lineRule="auto" w:after="200"/>
       </w:pPr>
       <w:r>
         <w:rPr>
@@ -367,25 +663,7 @@
           <w:i w:val="0"/>
           <w:sz w:val="24"/>
         </w:rPr>
-        <w:t xml:space="preserve">•  </w:t>
-      </w:r>
-      <w:r>
-        <w:rPr>
-          <w:rFonts w:ascii="Times New Roman" w:hAnsi="Times New Roman"/>
-          <w:b/>
-          <w:i w:val="0"/>
-          <w:sz w:val="24"/>
-        </w:rPr>
-        <w:t>Data integrity.</w:t>
-      </w:r>
-      <w:r>
-        <w:rPr>
-          <w:rFonts w:ascii="Times New Roman" w:hAnsi="Times New Roman"/>
-          <w:b w:val="0"/>
-          <w:i w:val="0"/>
-          <w:sz w:val="24"/>
-        </w:rPr>
-        <w:t xml:space="preserve"> Validate input in Java before it reaches the database, and let the database enforce rules too, with primary keys, NOT NULL, and foreign keys. Group related changes, such as creating an order and reducing stock, in one transaction.</w:t>
+        <w:t>Three concerns apply to all four:</w:t>
       </w:r>
     </w:p>
     <w:p>
@@ -418,49 +696,7 @@
           <w:i w:val="0"/>
           <w:sz w:val="24"/>
         </w:rPr>
-        <w:t xml:space="preserve"> Use PreparedStatement for every query that includes user input, connect with a database account that has only the permissions the application needs, and keep passwords out of the source code by reading them from configuration or environment variables.</w:t>
-      </w:r>
-    </w:p>
-    <w:p>
-      <w:pPr>
-        <w:spacing w:line="360" w:lineRule="auto" w:after="0"/>
-        <w:ind w:left="720" w:hanging="360"/>
-      </w:pPr>
-      <w:r>
-        <w:rPr>
-          <w:rFonts w:ascii="Times New Roman" w:hAnsi="Times New Roman"/>
-          <w:b w:val="0"/>
-          <w:i w:val="0"/>
-          <w:sz w:val="24"/>
-        </w:rPr>
-        <w:t xml:space="preserve">•  </w:t>
-      </w:r>
-      <w:r>
-        <w:rPr>
-          <w:rFonts w:ascii="Times New Roman" w:hAnsi="Times New Roman"/>
-          <w:b/>
-          <w:i w:val="0"/>
-          <w:sz w:val="24"/>
-        </w:rPr>
-        <w:t>Efficiency.</w:t>
-      </w:r>
-      <w:r>
-        <w:rPr>
-          <w:rFonts w:ascii="Times New Roman" w:hAnsi="Times New Roman"/>
-          <w:b w:val="0"/>
-          <w:i w:val="0"/>
-          <w:sz w:val="24"/>
-        </w:rPr>
-        <w:t xml:space="preserve"> In Read operations, select only the columns needed instead of SELECT </w:t>
-      </w:r>
-      <w:r>
-        <w:rPr>
-          <w:rFonts w:ascii="Times New Roman" w:hAnsi="Times New Roman"/>
-          <w:b w:val="0"/>
-          <w:i/>
-          <w:sz w:val="24"/>
-        </w:rPr>
-        <w:t>, add indexes on columns used in WHERE clauses, and page through large results instead of loading them all at once. Opening a connection is expensive, so production systems reuse connections from a pool rather than opening a new one for every request.</w:t>
+        <w:t xml:space="preserve"> Use PreparedStatement for any query containing user input, give the application a database account with only the permissions it needs, and read passwords from configuration rather than hard-coding them.</w:t>
       </w:r>
     </w:p>
     <w:p>
@@ -493,7 +729,7 @@
           <w:i w:val="0"/>
           <w:sz w:val="24"/>
         </w:rPr>
-        <w:t xml:space="preserve"> Every JDBC call can throw SQLException. Catch it, roll back any open transaction, log the details, and show the user a clear message rather than a stack trace.</w:t>
+        <w:t xml:space="preserve"> Every JDBC call can throw SQLException, so catch it, roll back any open transaction, and show the user a clear message instead of a stack trace.</w:t>
       </w:r>
     </w:p>
     <w:p>
@@ -517,7 +753,7 @@
           <w:i w:val="0"/>
           <w:sz w:val="24"/>
         </w:rPr>
-        <w:t>Deletes.</w:t>
+        <w:t>Connections.</w:t>
       </w:r>
       <w:r>
         <w:rPr>
@@ -526,7 +762,7 @@
           <w:i w:val="0"/>
           <w:sz w:val="24"/>
         </w:rPr>
-        <w:t xml:space="preserve"> A hard DELETE can break orders that reference a product, so many systems use a "soft delete", marking a row as inactive so its history is kept.</w:t>
+        <w:t xml:space="preserve"> Opening a connection is expensive, so production systems reuse connections from a pool instead of opening one per request.</w:t>
       </w:r>
     </w:p>
     <w:p>
@@ -577,7 +813,7 @@
           <w:i w:val="0"/>
           <w:sz w:val="24"/>
         </w:rPr>
-        <w:t>Word count: 733</w:t>
+        <w:t>Word count: 710</w:t>
       </w:r>
     </w:p>
     <w:p>

</xml_diff>